<commit_message>
Publish real KPI data, experiment results and cloud app dependencies
</commit_message>
<xml_diff>
--- a/docs/final/第8周_5G_AI项目技术结项报告.docx
+++ b/docs/final/第8周_5G_AI项目技术结项报告.docx
@@ -1684,7 +1684,7 @@
         <w:widowControl/>
       </w:pPr>
       <w:r>
-        <w:t>自动测试仍有边界：独立进程测试验证启动和 HTTP 服务，AppTest 验证 Streamlit 控件的回调与页面渲染；它们不能替代不同浏览器版本、屏幕分辨率、真实用户网络和长时间运行的验收。正式演示前仍应在本机浏览器依次打开五页，试一次 CSV 下载，并确认端口 8501 没有冲突。网站地址为 `http://127.0.0.1:8501`，该地址仅在运行服务的同一台电脑上可用，并非公网部署。项目根目录执行 `./week7/run_web.ps1` 启动，PowerShell 窗口保持打开；停止时按 Ctrl+C。</w:t>
+        <w:t>自动测试仍有边界：独立进程测试验证启动和 HTTP 服务，AppTest 验证 Streamlit 控件的回调与页面渲染；它们不能替代不同浏览器版本、屏幕分辨率、真实用户网络和长时间运行的验收。本机访问地址为 `http://127.0.0.1:8501`，需要在项目根目录执行 `./week7/run_web.ps1` 并保持 PowerShell 窗口打开，停止时按 Ctrl+C。公开网站已经从 GitHub 的 main 分支部署到 Streamlit Community Cloud，访问地址为 https://5g-ai-kpi-prediction-anomaly-detection-cybqywldc728xbu2uauevq.streamlit.app/ 。云端页面使用公开仓库中的处理后真实数据和历史实验结果，不依赖本机服务；但云端托管的可用性仍取决于第三方平台与网络。部署后已逐一打开系统总览、KPI 预测、异常检测、根因分析、数据浏览五页，并把浏览 KPI 从 1_1_22 切换到 11_0_19，确认图表和统计值更新。</w:t>
       </w:r>
     </w:p>
     <w:p>
@@ -1716,7 +1716,7 @@
         <w:widowControl/>
       </w:pPr>
       <w:r>
-        <w:t>GitHub 仓库已经在用户账户下创建并发布，地址为 https://github.com/Happypotter1/5g-ai-kpi-prediction-anomaly-detection ，可见性为私有。远端核对显示 main 分支包含 34 个代码和文档文件，包括报告、PPT、README、脚本与测试；没有上传恢复的 CSV、压缩包和实验图片。完整数据与实验结果仍保留在本地交付包中。因此 GitHub 仓库用于代码和文档审阅，克隆后如需运行依赖数据的页面，应按 README 从本地交付包补齐相应数据和结果文件。私有仓库仅授权成员可访问，不能将此地址当作公开演示网址。</w:t>
+        <w:t>GitHub 仓库已经在用户账户下公开发布，地址为 https://github.com/Happypotter1/5g-ai-kpi-prediction-anomaly-detection 。按项目所有者的公开交付决定，main 分支包含 114 个代码、文档和实验文件，其中有两份处理后的 DLPRB 真实 CSV、第 4–6 周结果与图表、报告、PPT、应用和测试。远端两份 CSV 的大小与 Git 对象校验值均与本地一致。原始 `DLPRB_train_0w-5w.csv` 仍未恢复，故仓库支持展示与历史结果复核，却不构成从原始数据重跑全部实验的证据。仓库地址用于代码与数据审阅；真正的 Web 入口是前述 streamlit.app 网址。</w:t>
       </w:r>
     </w:p>
     <w:p>

</xml_diff>

<commit_message>
test: publish verified public browser acceptance and updated final report
</commit_message>
<xml_diff>
--- a/docs/final/第8周_5G_AI项目技术结项报告.docx
+++ b/docs/final/第8周_5G_AI项目技术结项报告.docx
@@ -21,7 +21,9 @@
           <w:color w:val="000000"/>
           <w:sz w:val="50"/>
         </w:rPr>
-        <w:t>5G 网络 KPI 预测与异常检测项目技术结项报告</w:t>
+        <w:t>5G 网络 KPI 预测与异常检测</w:t>
+        <w:br/>
+        <w:t>项目技术结项报告</w:t>
       </w:r>
     </w:p>
     <w:p>
@@ -50,7 +52,7 @@
           <w:color w:val="000000"/>
           <w:sz w:val="22"/>
         </w:rPr>
-        <w:t>2026 年 9 月 26 日</w:t>
+        <w:t>2026 年 10 月 2 日</w:t>
       </w:r>
     </w:p>
     <w:p>
@@ -87,7 +89,7 @@
         <w:widowControl/>
       </w:pPr>
       <w:r>
-        <w:t>Windows Web 系统目前包含五个功能页面和本地启动脚本。第八周新增了独立进程启动、HTTP 健康检查与主页响应测试，并通过 Streamlit 的页面测试覆盖导航、结果组切换、模型选择、异常策略切换、根因数量调整和 KPI 时间范围筛选。测试为应用功能与结果文件一致性提供证据，但没有真实故障标签，不能把候选异常的数量解释成检测准确率，也不能把统计关联排名解释成故障因果结论。原始 DLPRB 文件在当前恢复包中未找到；本地系统使用已恢复的清洗和归一化数据，重新执行第三周原始预处理仍依赖该原文件。</w:t>
+        <w:t>Windows Web 系统目前包含五个功能页面、本地启动脚本与公开网站入口。2026 年 10 月 2 日真实浏览器复验在本地和公网均为 4/4 通过，原有 Python 测试为 9/9 通过。第八周新增了独立进程启动、HTTP 健康检查与主页响应测试，并通过 Streamlit 的页面测试覆盖导航、结果组切换、模型选择、异常策略切换、根因数量调整和 KPI 时间范围筛选。测试为应用功能与结果文件一致性提供证据，但没有真实故障标签，不能把候选异常的数量解释成检测准确率，也不能把统计关联排名解释成故障因果结论。原始 DLPRB 文件在当前恢复包中未找到；本地系统使用已恢复的清洗和归一化数据，重新执行第三周原始预处理仍依赖该原文件。</w:t>
       </w:r>
     </w:p>
     <w:p>
@@ -1676,7 +1678,7 @@
         <w:widowControl/>
       </w:pPr>
       <w:r>
-        <w:t>第八周扩展的测试分两层。第一层将 Streamlit 作为独立进程在空闲本地端口启动，轮询其健康接口，要求返回 HTTP 200，再访问主页，检查服务器有实际响应，最后正常终止测试进程。第二层通过 Streamlit AppTest 真正运行页面脚本并改变控件值：进入预测页，切换到 Transformer 组，清空模型选择并检查警告；进入异常页，切换到共同异常，核对页面显示 17 个候选；进入根因页调整 Top N；进入数据浏览页选择 KPI 并缩小时间范围，核对样本数量。旧有数据完整性、指标字段、预测结果和异常一致性测试仍保留。当前这组自动测试共 9 项通过，说明在当前 Windows 环境、恢复数据和依赖版本下，主要页面和数据路径形成了可运行闭环。</w:t>
+        <w:t>第八周扩展的自动测试分为三个层次。数据层核查页面所需文件、模型指标字段、预测列、异常集合和 2880 列 KPI 目录；应用层以独立 Streamlit 进程验证随机端口启动、健康接口 HTTP 200 和首页响应，再通过 AppTest 运行页面脚本、改变结果组、模型选择、异常策略、根因 Top N 和数据筛选；真实浏览器层用 Playwright 驱动 Microsoft Edge，直接点击页面控件并下载 CSV。2026 年 10 月 2 日复验结果为 Python 测试 9/9 通过，本地 Edge 浏览器用例 4/4 通过，公网 Edge 浏览器用例 4/4 通过。公网四项用例总耗时约 51 秒，本地四项约 15 秒。</w:t>
       </w:r>
     </w:p>
     <w:p>
@@ -1684,7 +1686,610 @@
         <w:widowControl/>
       </w:pPr>
       <w:r>
-        <w:t>自动测试仍有边界：独立进程测试验证启动和 HTTP 服务，AppTest 验证 Streamlit 控件的回调与页面渲染；它们不能替代不同浏览器版本、屏幕分辨率、真实用户网络和长时间运行的验收。本机访问地址为 `http://127.0.0.1:8501`，需要在项目根目录执行 `./week7/run_web.ps1` 并保持 PowerShell 窗口打开，停止时按 Ctrl+C。公开网站已经从 GitHub 的 main 分支部署到 Streamlit Community Cloud，访问地址为 https://5g-ai-kpi-prediction-anomaly-detection-cybqywldc728xbu2uauevq.streamlit.app/ 。云端页面使用公开仓库中的处理后真实数据和历史实验结果，不依赖本机服务；但云端托管的可用性仍取决于第三方平台与网络。部署后已逐一打开系统总览、KPI 预测、异常检测、根因分析、数据浏览五页，并把浏览 KPI 从 1_1_22 切换到 11_0_19，确认图表和统计值更新。</w:t>
+        <w:t>浏览器用例一核对系统总览的 8 个模型与 40/840 异常时刻，进入预测页切换到 Transformer 结果组，下载文件并检查 CSV 包含 Transformer 列。用例二进入异常检测，确认 3σ/IQR 零异常解释可见，并把异常并集切换为共同异常，核对异常时刻由 40 变为 17。用例三检查根因候选指标定义和加权公式，把 Top N 调到 5，并验证图中只有 5 个 KPI 标签。用例四选择 KPI 11_0_19，将时间范围缩小为 839 个样本，下载后核对文件名、字段及 839 行数据。校验下载内容使测试能识别页面已显示新条件、下载按钮仍对应旧结果的异步更新窗口。</w:t>
+      </w:r>
+    </w:p>
+    <w:p>
+      <w:pPr>
+        <w:widowControl/>
+      </w:pPr>
+      <w:r>
+        <w:t>本轮公网首次检查发现两项下载断言失败。定位表明页面回传有先后顺序：模型标签或样本数先更新，下载控件随后更新，测试在后者完成前点击了旧控件。因此测试增加图表目标模型、页面非 stale 状态和后台运行标记消失的等待条件，保持 Transformer 列与 839 行的内容断言。修正后在同一公网应用复验，四项全部通过；本地测试同时复验通过。该处理针对自动化与页面更新的同步，没有改变实验数据、检测阈值或统计结论。</w:t>
+      </w:r>
+    </w:p>
+    <w:p>
+      <w:pPr>
+        <w:keepNext/>
+        <w:jc w:val="center"/>
+      </w:pPr>
+      <w:r>
+        <w:rPr>
+          <w:rFonts w:ascii="Microsoft YaHei" w:hAnsi="Microsoft YaHei" w:eastAsia="Microsoft YaHei"/>
+          <w:color w:val="555555"/>
+          <w:sz w:val="18"/>
+        </w:rPr>
+        <w:t>2026年10月2日自动化验收结果</w:t>
+      </w:r>
+    </w:p>
+    <w:tbl>
+      <w:tblPr>
+        <w:tblW w:type="auto" w:w="0"/>
+        <w:jc w:val="center"/>
+        <w:tblLayout w:type="fixed"/>
+        <w:tblLook w:firstColumn="1" w:firstRow="1" w:lastColumn="0" w:lastRow="0" w:noHBand="0" w:noVBand="1" w:val="04A0"/>
+      </w:tblPr>
+      <w:tblGrid>
+        <w:gridCol w:w="2436"/>
+        <w:gridCol w:w="2436"/>
+        <w:gridCol w:w="2436"/>
+        <w:gridCol w:w="2436"/>
+      </w:tblGrid>
+      <w:tr>
+        <w:tc>
+          <w:tcPr>
+            <w:tcW w:type="dxa" w:w="2436"/>
+            <w:vAlign w:val="center"/>
+            <w:tcBorders>
+              <w:top w:val="single" w:sz="4" w:color="D9D9D9"/>
+              <w:left w:val="single" w:sz="4" w:color="D9D9D9"/>
+              <w:bottom w:val="single" w:sz="4" w:color="D9D9D9"/>
+              <w:right w:val="single" w:sz="4" w:color="D9D9D9"/>
+            </w:tcBorders>
+            <w:shd w:fill="17365D"/>
+          </w:tcPr>
+          <w:p>
+            <w:pPr>
+              <w:spacing w:after="0" w:before="0"/>
+            </w:pPr>
+            <w:r>
+              <w:rPr>
+                <w:rFonts w:ascii="Microsoft YaHei" w:hAnsi="Microsoft YaHei" w:eastAsia="Microsoft YaHei"/>
+                <w:b/>
+                <w:color w:val="FFFFFF"/>
+                <w:sz w:val="18"/>
+              </w:rPr>
+              <w:t>测试层</w:t>
+            </w:r>
+          </w:p>
+        </w:tc>
+        <w:tc>
+          <w:tcPr>
+            <w:tcW w:type="dxa" w:w="2436"/>
+            <w:vAlign w:val="center"/>
+            <w:tcBorders>
+              <w:top w:val="single" w:sz="4" w:color="D9D9D9"/>
+              <w:left w:val="single" w:sz="4" w:color="D9D9D9"/>
+              <w:bottom w:val="single" w:sz="4" w:color="D9D9D9"/>
+              <w:right w:val="single" w:sz="4" w:color="D9D9D9"/>
+            </w:tcBorders>
+            <w:shd w:fill="17365D"/>
+          </w:tcPr>
+          <w:p>
+            <w:pPr>
+              <w:spacing w:after="0" w:before="0"/>
+            </w:pPr>
+            <w:r>
+              <w:rPr>
+                <w:rFonts w:ascii="Microsoft YaHei" w:hAnsi="Microsoft YaHei" w:eastAsia="Microsoft YaHei"/>
+                <w:b/>
+                <w:color w:val="FFFFFF"/>
+                <w:sz w:val="18"/>
+              </w:rPr>
+              <w:t>执行环境</w:t>
+            </w:r>
+          </w:p>
+        </w:tc>
+        <w:tc>
+          <w:tcPr>
+            <w:tcW w:type="dxa" w:w="2436"/>
+            <w:vAlign w:val="center"/>
+            <w:tcBorders>
+              <w:top w:val="single" w:sz="4" w:color="D9D9D9"/>
+              <w:left w:val="single" w:sz="4" w:color="D9D9D9"/>
+              <w:bottom w:val="single" w:sz="4" w:color="D9D9D9"/>
+              <w:right w:val="single" w:sz="4" w:color="D9D9D9"/>
+            </w:tcBorders>
+            <w:shd w:fill="17365D"/>
+          </w:tcPr>
+          <w:p>
+            <w:pPr>
+              <w:spacing w:after="0" w:before="0"/>
+            </w:pPr>
+            <w:r>
+              <w:rPr>
+                <w:rFonts w:ascii="Microsoft YaHei" w:hAnsi="Microsoft YaHei" w:eastAsia="Microsoft YaHei"/>
+                <w:b/>
+                <w:color w:val="FFFFFF"/>
+                <w:sz w:val="18"/>
+              </w:rPr>
+              <w:t>通过</w:t>
+            </w:r>
+          </w:p>
+        </w:tc>
+        <w:tc>
+          <w:tcPr>
+            <w:tcW w:type="dxa" w:w="2436"/>
+            <w:vAlign w:val="center"/>
+            <w:tcBorders>
+              <w:top w:val="single" w:sz="4" w:color="D9D9D9"/>
+              <w:left w:val="single" w:sz="4" w:color="D9D9D9"/>
+              <w:bottom w:val="single" w:sz="4" w:color="D9D9D9"/>
+              <w:right w:val="single" w:sz="4" w:color="D9D9D9"/>
+            </w:tcBorders>
+            <w:shd w:fill="17365D"/>
+          </w:tcPr>
+          <w:p>
+            <w:pPr>
+              <w:spacing w:after="0" w:before="0"/>
+            </w:pPr>
+            <w:r>
+              <w:rPr>
+                <w:rFonts w:ascii="Microsoft YaHei" w:hAnsi="Microsoft YaHei" w:eastAsia="Microsoft YaHei"/>
+                <w:b/>
+                <w:color w:val="FFFFFF"/>
+                <w:sz w:val="18"/>
+              </w:rPr>
+              <w:t>失败</w:t>
+            </w:r>
+          </w:p>
+        </w:tc>
+      </w:tr>
+      <w:tr>
+        <w:tc>
+          <w:tcPr>
+            <w:tcW w:type="dxa" w:w="2436"/>
+            <w:vAlign w:val="center"/>
+            <w:tcBorders>
+              <w:top w:val="single" w:sz="4" w:color="D9D9D9"/>
+              <w:left w:val="single" w:sz="4" w:color="D9D9D9"/>
+              <w:bottom w:val="single" w:sz="4" w:color="D9D9D9"/>
+              <w:right w:val="single" w:sz="4" w:color="D9D9D9"/>
+            </w:tcBorders>
+          </w:tcPr>
+          <w:p>
+            <w:pPr>
+              <w:spacing w:after="0" w:before="0"/>
+            </w:pPr>
+            <w:r>
+              <w:rPr>
+                <w:rFonts w:ascii="Microsoft YaHei" w:hAnsi="Microsoft YaHei" w:eastAsia="Microsoft YaHei"/>
+                <w:b w:val="0"/>
+                <w:color w:val="000000"/>
+                <w:sz w:val="18"/>
+              </w:rPr>
+              <w:t>Python数据与应用测试</w:t>
+            </w:r>
+          </w:p>
+        </w:tc>
+        <w:tc>
+          <w:tcPr>
+            <w:tcW w:type="dxa" w:w="2436"/>
+            <w:vAlign w:val="center"/>
+            <w:tcBorders>
+              <w:top w:val="single" w:sz="4" w:color="D9D9D9"/>
+              <w:left w:val="single" w:sz="4" w:color="D9D9D9"/>
+              <w:bottom w:val="single" w:sz="4" w:color="D9D9D9"/>
+              <w:right w:val="single" w:sz="4" w:color="D9D9D9"/>
+            </w:tcBorders>
+          </w:tcPr>
+          <w:p>
+            <w:pPr>
+              <w:spacing w:after="0" w:before="0"/>
+            </w:pPr>
+            <w:r>
+              <w:rPr>
+                <w:rFonts w:ascii="Microsoft YaHei" w:hAnsi="Microsoft YaHei" w:eastAsia="Microsoft YaHei"/>
+                <w:b w:val="0"/>
+                <w:color w:val="000000"/>
+                <w:sz w:val="18"/>
+              </w:rPr>
+              <w:t>Windows Python 3.12</w:t>
+            </w:r>
+          </w:p>
+        </w:tc>
+        <w:tc>
+          <w:tcPr>
+            <w:tcW w:type="dxa" w:w="2436"/>
+            <w:vAlign w:val="center"/>
+            <w:tcBorders>
+              <w:top w:val="single" w:sz="4" w:color="D9D9D9"/>
+              <w:left w:val="single" w:sz="4" w:color="D9D9D9"/>
+              <w:bottom w:val="single" w:sz="4" w:color="D9D9D9"/>
+              <w:right w:val="single" w:sz="4" w:color="D9D9D9"/>
+            </w:tcBorders>
+          </w:tcPr>
+          <w:p>
+            <w:pPr>
+              <w:spacing w:after="0" w:before="0"/>
+            </w:pPr>
+            <w:r>
+              <w:rPr>
+                <w:rFonts w:ascii="Microsoft YaHei" w:hAnsi="Microsoft YaHei" w:eastAsia="Microsoft YaHei"/>
+                <w:b w:val="0"/>
+                <w:color w:val="000000"/>
+                <w:sz w:val="18"/>
+              </w:rPr>
+              <w:t>9</w:t>
+            </w:r>
+          </w:p>
+        </w:tc>
+        <w:tc>
+          <w:tcPr>
+            <w:tcW w:type="dxa" w:w="2436"/>
+            <w:vAlign w:val="center"/>
+            <w:tcBorders>
+              <w:top w:val="single" w:sz="4" w:color="D9D9D9"/>
+              <w:left w:val="single" w:sz="4" w:color="D9D9D9"/>
+              <w:bottom w:val="single" w:sz="4" w:color="D9D9D9"/>
+              <w:right w:val="single" w:sz="4" w:color="D9D9D9"/>
+            </w:tcBorders>
+          </w:tcPr>
+          <w:p>
+            <w:pPr>
+              <w:spacing w:after="0" w:before="0"/>
+            </w:pPr>
+            <w:r>
+              <w:rPr>
+                <w:rFonts w:ascii="Microsoft YaHei" w:hAnsi="Microsoft YaHei" w:eastAsia="Microsoft YaHei"/>
+                <w:b w:val="0"/>
+                <w:color w:val="000000"/>
+                <w:sz w:val="18"/>
+              </w:rPr>
+              <w:t>0</w:t>
+            </w:r>
+          </w:p>
+        </w:tc>
+      </w:tr>
+      <w:tr>
+        <w:tc>
+          <w:tcPr>
+            <w:tcW w:type="dxa" w:w="2436"/>
+            <w:vAlign w:val="center"/>
+            <w:tcBorders>
+              <w:top w:val="single" w:sz="4" w:color="D9D9D9"/>
+              <w:left w:val="single" w:sz="4" w:color="D9D9D9"/>
+              <w:bottom w:val="single" w:sz="4" w:color="D9D9D9"/>
+              <w:right w:val="single" w:sz="4" w:color="D9D9D9"/>
+            </w:tcBorders>
+            <w:shd w:fill="F3F6FA"/>
+          </w:tcPr>
+          <w:p>
+            <w:pPr>
+              <w:spacing w:after="0" w:before="0"/>
+            </w:pPr>
+            <w:r>
+              <w:rPr>
+                <w:rFonts w:ascii="Microsoft YaHei" w:hAnsi="Microsoft YaHei" w:eastAsia="Microsoft YaHei"/>
+                <w:b w:val="0"/>
+                <w:color w:val="000000"/>
+                <w:sz w:val="18"/>
+              </w:rPr>
+              <w:t>真实浏览器本地测试</w:t>
+            </w:r>
+          </w:p>
+        </w:tc>
+        <w:tc>
+          <w:tcPr>
+            <w:tcW w:type="dxa" w:w="2436"/>
+            <w:vAlign w:val="center"/>
+            <w:tcBorders>
+              <w:top w:val="single" w:sz="4" w:color="D9D9D9"/>
+              <w:left w:val="single" w:sz="4" w:color="D9D9D9"/>
+              <w:bottom w:val="single" w:sz="4" w:color="D9D9D9"/>
+              <w:right w:val="single" w:sz="4" w:color="D9D9D9"/>
+            </w:tcBorders>
+            <w:shd w:fill="F3F6FA"/>
+          </w:tcPr>
+          <w:p>
+            <w:pPr>
+              <w:spacing w:after="0" w:before="0"/>
+            </w:pPr>
+            <w:r>
+              <w:rPr>
+                <w:rFonts w:ascii="Microsoft YaHei" w:hAnsi="Microsoft YaHei" w:eastAsia="Microsoft YaHei"/>
+                <w:b w:val="0"/>
+                <w:color w:val="000000"/>
+                <w:sz w:val="18"/>
+              </w:rPr>
+              <w:t>Microsoft Edge</w:t>
+            </w:r>
+          </w:p>
+        </w:tc>
+        <w:tc>
+          <w:tcPr>
+            <w:tcW w:type="dxa" w:w="2436"/>
+            <w:vAlign w:val="center"/>
+            <w:tcBorders>
+              <w:top w:val="single" w:sz="4" w:color="D9D9D9"/>
+              <w:left w:val="single" w:sz="4" w:color="D9D9D9"/>
+              <w:bottom w:val="single" w:sz="4" w:color="D9D9D9"/>
+              <w:right w:val="single" w:sz="4" w:color="D9D9D9"/>
+            </w:tcBorders>
+            <w:shd w:fill="F3F6FA"/>
+          </w:tcPr>
+          <w:p>
+            <w:pPr>
+              <w:spacing w:after="0" w:before="0"/>
+            </w:pPr>
+            <w:r>
+              <w:rPr>
+                <w:rFonts w:ascii="Microsoft YaHei" w:hAnsi="Microsoft YaHei" w:eastAsia="Microsoft YaHei"/>
+                <w:b w:val="0"/>
+                <w:color w:val="000000"/>
+                <w:sz w:val="18"/>
+              </w:rPr>
+              <w:t>4</w:t>
+            </w:r>
+          </w:p>
+        </w:tc>
+        <w:tc>
+          <w:tcPr>
+            <w:tcW w:type="dxa" w:w="2436"/>
+            <w:vAlign w:val="center"/>
+            <w:tcBorders>
+              <w:top w:val="single" w:sz="4" w:color="D9D9D9"/>
+              <w:left w:val="single" w:sz="4" w:color="D9D9D9"/>
+              <w:bottom w:val="single" w:sz="4" w:color="D9D9D9"/>
+              <w:right w:val="single" w:sz="4" w:color="D9D9D9"/>
+            </w:tcBorders>
+            <w:shd w:fill="F3F6FA"/>
+          </w:tcPr>
+          <w:p>
+            <w:pPr>
+              <w:spacing w:after="0" w:before="0"/>
+            </w:pPr>
+            <w:r>
+              <w:rPr>
+                <w:rFonts w:ascii="Microsoft YaHei" w:hAnsi="Microsoft YaHei" w:eastAsia="Microsoft YaHei"/>
+                <w:b w:val="0"/>
+                <w:color w:val="000000"/>
+                <w:sz w:val="18"/>
+              </w:rPr>
+              <w:t>0</w:t>
+            </w:r>
+          </w:p>
+        </w:tc>
+      </w:tr>
+      <w:tr>
+        <w:tc>
+          <w:tcPr>
+            <w:tcW w:type="dxa" w:w="2436"/>
+            <w:vAlign w:val="center"/>
+            <w:tcBorders>
+              <w:top w:val="single" w:sz="4" w:color="D9D9D9"/>
+              <w:left w:val="single" w:sz="4" w:color="D9D9D9"/>
+              <w:bottom w:val="single" w:sz="4" w:color="D9D9D9"/>
+              <w:right w:val="single" w:sz="4" w:color="D9D9D9"/>
+            </w:tcBorders>
+          </w:tcPr>
+          <w:p>
+            <w:pPr>
+              <w:spacing w:after="0" w:before="0"/>
+            </w:pPr>
+            <w:r>
+              <w:rPr>
+                <w:rFonts w:ascii="Microsoft YaHei" w:hAnsi="Microsoft YaHei" w:eastAsia="Microsoft YaHei"/>
+                <w:b w:val="0"/>
+                <w:color w:val="000000"/>
+                <w:sz w:val="18"/>
+              </w:rPr>
+              <w:t>真实浏览器公网测试</w:t>
+            </w:r>
+          </w:p>
+        </w:tc>
+        <w:tc>
+          <w:tcPr>
+            <w:tcW w:type="dxa" w:w="2436"/>
+            <w:vAlign w:val="center"/>
+            <w:tcBorders>
+              <w:top w:val="single" w:sz="4" w:color="D9D9D9"/>
+              <w:left w:val="single" w:sz="4" w:color="D9D9D9"/>
+              <w:bottom w:val="single" w:sz="4" w:color="D9D9D9"/>
+              <w:right w:val="single" w:sz="4" w:color="D9D9D9"/>
+            </w:tcBorders>
+          </w:tcPr>
+          <w:p>
+            <w:pPr>
+              <w:spacing w:after="0" w:before="0"/>
+            </w:pPr>
+            <w:r>
+              <w:rPr>
+                <w:rFonts w:ascii="Microsoft YaHei" w:hAnsi="Microsoft YaHei" w:eastAsia="Microsoft YaHei"/>
+                <w:b w:val="0"/>
+                <w:color w:val="000000"/>
+                <w:sz w:val="18"/>
+              </w:rPr>
+              <w:t>Microsoft Edge Community Cloud</w:t>
+            </w:r>
+          </w:p>
+        </w:tc>
+        <w:tc>
+          <w:tcPr>
+            <w:tcW w:type="dxa" w:w="2436"/>
+            <w:vAlign w:val="center"/>
+            <w:tcBorders>
+              <w:top w:val="single" w:sz="4" w:color="D9D9D9"/>
+              <w:left w:val="single" w:sz="4" w:color="D9D9D9"/>
+              <w:bottom w:val="single" w:sz="4" w:color="D9D9D9"/>
+              <w:right w:val="single" w:sz="4" w:color="D9D9D9"/>
+            </w:tcBorders>
+          </w:tcPr>
+          <w:p>
+            <w:pPr>
+              <w:spacing w:after="0" w:before="0"/>
+            </w:pPr>
+            <w:r>
+              <w:rPr>
+                <w:rFonts w:ascii="Microsoft YaHei" w:hAnsi="Microsoft YaHei" w:eastAsia="Microsoft YaHei"/>
+                <w:b w:val="0"/>
+                <w:color w:val="000000"/>
+                <w:sz w:val="18"/>
+              </w:rPr>
+              <w:t>4</w:t>
+            </w:r>
+          </w:p>
+        </w:tc>
+        <w:tc>
+          <w:tcPr>
+            <w:tcW w:type="dxa" w:w="2436"/>
+            <w:vAlign w:val="center"/>
+            <w:tcBorders>
+              <w:top w:val="single" w:sz="4" w:color="D9D9D9"/>
+              <w:left w:val="single" w:sz="4" w:color="D9D9D9"/>
+              <w:bottom w:val="single" w:sz="4" w:color="D9D9D9"/>
+              <w:right w:val="single" w:sz="4" w:color="D9D9D9"/>
+            </w:tcBorders>
+          </w:tcPr>
+          <w:p>
+            <w:pPr>
+              <w:spacing w:after="0" w:before="0"/>
+            </w:pPr>
+            <w:r>
+              <w:rPr>
+                <w:rFonts w:ascii="Microsoft YaHei" w:hAnsi="Microsoft YaHei" w:eastAsia="Microsoft YaHei"/>
+                <w:b w:val="0"/>
+                <w:color w:val="000000"/>
+                <w:sz w:val="18"/>
+              </w:rPr>
+              <w:t>0</w:t>
+            </w:r>
+          </w:p>
+        </w:tc>
+      </w:tr>
+    </w:tbl>
+    <w:p/>
+    <w:p>
+      <w:pPr>
+        <w:widowControl/>
+      </w:pPr>
+      <w:r>
+        <w:t>本机访问地址为 `http://127.0.0.1:8501`，在项目根目录运行 `./week7/run_web.ps1` 并保持服务进程打开即可访问。公开网站由 GitHub main 分支部署到 Streamlit Community Cloud，地址为 https://5g-ai-kpi-prediction-anomaly-detection-cybqywldc728xbu2uauevq.streamlit.app/ 。公网应用因长期未访问会休眠，本次通过网站的唤醒按钮恢复后再执行验收。测试的 BASE_URL 参数指向公网时，不启动本地服务；未设置时自行启动随机端口的本地服务，两种模式运行同一组交互与下载断言。源码位于 `week7/e2e/browser.test.cjs`，运行说明见 `week7/README.md`。</w:t>
+      </w:r>
+    </w:p>
+    <w:p>
+      <w:pPr>
+        <w:widowControl/>
+      </w:pPr>
+      <w:r>
+        <w:t>测试证据位于 `docs/acceptance/2026-10-02`，local 和 cloud 子目录分别保存四个页面截图、实际下载的预测与 KPI CSV、以及 results.json。JSON 记录目标地址、浏览器版本、时间戳、逐项状态和耗时；本轮浏览器版本为 Microsoft Edge 154.0.4258.48。下图取自公网自动化过程中，分别展示共同异常与零计数解释、根因候选指标定义。证据用于核对本轮功能行为，不替代真实故障标签，也不能把排名分数理解为因果概率。</w:t>
+      </w:r>
+    </w:p>
+    <w:p>
+      <w:pPr>
+        <w:keepNext/>
+        <w:spacing w:before="100"/>
+        <w:jc w:val="center"/>
+      </w:pPr>
+      <w:r>
+        <w:drawing>
+          <wp:inline xmlns:a="http://schemas.openxmlformats.org/drawingml/2006/main" xmlns:pic="http://schemas.openxmlformats.org/drawingml/2006/picture">
+            <wp:extent cx="5029200" cy="4889500"/>
+            <wp:docPr id="7" name="Picture 7"/>
+            <wp:cNvGraphicFramePr>
+              <a:graphicFrameLocks noChangeAspect="1"/>
+            </wp:cNvGraphicFramePr>
+            <a:graphic>
+              <a:graphicData uri="http://schemas.openxmlformats.org/drawingml/2006/picture">
+                <pic:pic>
+                  <pic:nvPicPr>
+                    <pic:cNvPr id="0" name="02-anomaly.png"/>
+                    <pic:cNvPicPr/>
+                  </pic:nvPicPr>
+                  <pic:blipFill>
+                    <a:blip r:embed="rId17"/>
+                    <a:stretch>
+                      <a:fillRect/>
+                    </a:stretch>
+                  </pic:blipFill>
+                  <pic:spPr>
+                    <a:xfrm>
+                      <a:off x="0" y="0"/>
+                      <a:ext cx="5029200" cy="4889500"/>
+                    </a:xfrm>
+                    <a:prstGeom prst="rect"/>
+                  </pic:spPr>
+                </pic:pic>
+              </a:graphicData>
+            </a:graphic>
+          </wp:inline>
+        </w:drawing>
+      </w:r>
+    </w:p>
+    <w:p>
+      <w:pPr>
+        <w:jc w:val="center"/>
+      </w:pPr>
+      <w:r>
+        <w:rPr>
+          <w:rFonts w:ascii="Microsoft YaHei" w:hAnsi="Microsoft YaHei" w:eastAsia="Microsoft YaHei"/>
+          <w:color w:val="555555"/>
+          <w:sz w:val="18"/>
+        </w:rPr>
+        <w:t>图 7  公网浏览器异常策略切换与统计零计数说明</w:t>
+      </w:r>
+    </w:p>
+    <w:p/>
+    <w:p>
+      <w:pPr>
+        <w:keepNext/>
+        <w:spacing w:before="100"/>
+        <w:jc w:val="center"/>
+      </w:pPr>
+      <w:r>
+        <w:drawing>
+          <wp:inline xmlns:a="http://schemas.openxmlformats.org/drawingml/2006/main" xmlns:pic="http://schemas.openxmlformats.org/drawingml/2006/picture">
+            <wp:extent cx="5029200" cy="4889500"/>
+            <wp:docPr id="8" name="Picture 8"/>
+            <wp:cNvGraphicFramePr>
+              <a:graphicFrameLocks noChangeAspect="1"/>
+            </wp:cNvGraphicFramePr>
+            <a:graphic>
+              <a:graphicData uri="http://schemas.openxmlformats.org/drawingml/2006/picture">
+                <pic:pic>
+                  <pic:nvPicPr>
+                    <pic:cNvPr id="0" name="03-root-causes.png"/>
+                    <pic:cNvPicPr/>
+                  </pic:nvPicPr>
+                  <pic:blipFill>
+                    <a:blip r:embed="rId18"/>
+                    <a:stretch>
+                      <a:fillRect/>
+                    </a:stretch>
+                  </pic:blipFill>
+                  <pic:spPr>
+                    <a:xfrm>
+                      <a:off x="0" y="0"/>
+                      <a:ext cx="5029200" cy="4889500"/>
+                    </a:xfrm>
+                    <a:prstGeom prst="rect"/>
+                  </pic:spPr>
+                </pic:pic>
+              </a:graphicData>
+            </a:graphic>
+          </wp:inline>
+        </w:drawing>
+      </w:r>
+    </w:p>
+    <w:p>
+      <w:pPr>
+        <w:jc w:val="center"/>
+      </w:pPr>
+      <w:r>
+        <w:rPr>
+          <w:rFonts w:ascii="Microsoft YaHei" w:hAnsi="Microsoft YaHei" w:eastAsia="Microsoft YaHei"/>
+          <w:color w:val="555555"/>
+          <w:sz w:val="18"/>
+        </w:rPr>
+        <w:t>图 8  公网浏览器根因候选定义与五个KPI展示</w:t>
+      </w:r>
+    </w:p>
+    <w:p/>
+    <w:p>
+      <w:pPr>
+        <w:widowControl/>
+      </w:pPr>
+      <w:r>
+        <w:t>验收边界限定为本轮 Windows Microsoft Edge、现有处理后数据和所列操作。已通过公网交互与下载不意味着覆盖所有浏览器、移动端分辨率、并发负载或长期可用性；应用的休眠和唤醒仍由托管平台控制。后续生产部署应追加权限、并发和持续监控测试。2026 年 9 月 27 日因云端休眠而超时的检查属于历史记录，本轮成功唤醒与 4/4 通过结果更新了当时尚未完成的公网验收状态。</w:t>
       </w:r>
     </w:p>
     <w:p>
@@ -1716,7 +2321,7 @@
         <w:widowControl/>
       </w:pPr>
       <w:r>
-        <w:t>GitHub 仓库已经在用户账户下公开发布，地址为 https://github.com/Happypotter1/5g-ai-kpi-prediction-anomaly-detection 。按项目所有者的公开交付决定，main 分支包含 114 个代码、文档和实验文件，其中有两份处理后的 DLPRB 真实 CSV、第 4–6 周结果与图表、报告、PPT、应用和测试。远端两份 CSV 的大小与 Git 对象校验值均与本地一致。原始 `DLPRB_train_0w-5w.csv` 仍未恢复，故仓库支持展示与历史结果复核，却不构成从原始数据重跑全部实验的证据。仓库地址用于代码与数据审阅；真正的 Web 入口是前述 streamlit.app 网址。</w:t>
+        <w:t>GitHub 仓库已经在用户账户下公开发布，地址为 https://github.com/Happypotter1/5g-ai-kpi-prediction-anomaly-detection 。按项目所有者的公开交付决定，初次发布时 main 分支包含 114 个代码、文档和实验文件，后续补入浏览器测试与验收证据，其中有两份处理后的 DLPRB 真实 CSV、第 4–6 周结果与图表、报告、PPT、应用和测试。远端两份 CSV 的大小与 Git 对象校验值均与本地一致。原始 `DLPRB_train_0w-5w.csv` 仍未恢复，故仓库支持展示与历史结果复核，却不构成从原始数据重跑全部实验的证据。仓库地址用于代码与数据审阅；真正的 Web 入口是前述 streamlit.app 网址。</w:t>
       </w:r>
     </w:p>
     <w:p>
@@ -1844,7 +2449,7 @@
         <w:widowControl/>
       </w:pPr>
       <w:r>
-        <w:t>项目技术报告概括方法、结果与限制；项目演示 PPT 按背景、数据、预测、异常、系统和结论组织；干净工程目录包含 Windows 启动入口、关键代码、测试与文档。第 1–2 周的 Ubuntu 历史证据留在原工作区归档。数据资产以恢复的 `DLPRB_cleaned.csv` 和 `DLPRB_normalized.csv` 为主；第 4–6 周 CSV 和图表保留各自周次与任务范围。测试命令为 `python -m pytest week7/tests -q`，预期当前结果为 9 passed。项目报告所用的历史事实主要取自第 1 周环境搭建汇报、第 2 周协议分析报告、第 3 周预处理摘要、第 4–5 周指标与总结、第 6 周统计与根因结果及第 7 周应用代码和验收材料。读者核查任一结果时，应同时记录原始文件、生成脚本、时间范围和评价口径。</w:t>
+        <w:t>项目技术报告概括方法、结果与限制；项目演示 PPT 按背景、数据、预测、异常、系统和结论组织；干净工程目录包含 Windows 启动入口、关键代码、测试与文档。第 1–2 周的 Ubuntu 历史证据留在原工作区归档。数据资产以恢复的 `DLPRB_cleaned.csv` 和 `DLPRB_normalized.csv` 为主；第 4–6 周 CSV 和图表保留各自周次与任务范围。Python 测试命令为 `python -m pytest week7/tests -q`，本轮结果为 9 passed。浏览器测试在 week7/e2e 安装依赖后执行 `npm test`；设置 BASE_URL 可验收公网网站，本轮本地与公网分别为 4 passed。项目报告所用的历史事实主要取自第 1 周环境搭建汇报、第 2 周协议分析报告、第 3 周预处理摘要、第 4–5 周指标与总结、第 6 周统计与根因结果及第 7 周应用代码和验收材料。读者核查任一结果时，应同时记录原始文件、生成脚本、时间范围和评价口径。</w:t>
       </w:r>
     </w:p>
     <w:sectPr>

</xml_diff>